<commit_message>
Updated the title of the last chapter to "The Valley That Waits" and added a link to it in the table of contents. New file "six winds.md" has been added to the project.
</commit_message>
<xml_diff>
--- a/11 - The Valley That Waits.docx
+++ b/11 - The Valley That Waits.docx
@@ -320,7 +320,7 @@
         <w:t>He squints, t</w:t>
       </w:r>
       <w:r>
-        <w:t>rying to see what it is, but the moonlight doesn’t reveal anything other than it’s a picture of some sort. The wolf closes the hatch and nudges Jack back towards the fire. He tries to tip-toe back in an effort to keep his feet from finding every acorn, rock, twig, and whatever else keeps digging in. He finally decides on long strides and short leaps before getting back to the fire. He sets the picture down, anchoring it with a cup</w:t>
+        <w:t>rying to see what it is, but the moonlight doesn’t reveal anything other than it’s a picture of some sort. The wolf closes the hatch and nudges Jack back towards the fire. He tries to tiptoe back in an effort to keep his feet from finding every acorn, rock, twig, and whatever else keeps digging in. He finally decides on long strides and short leaps before getting back to the fire. He sets the picture down, anchoring it with a cup</w:t>
       </w:r>
       <w:r>
         <w:t>,</w:t>
@@ -562,15 +562,7 @@
     </w:p>
     <w:p>
       <w:r>
-        <w:t xml:space="preserve">The wolf growls at Jack, ending in another big sigh and rolling her eyes. She puts her front legs out straight and puts her head down, closing her eyes. Jack stares at her for a moment before uttering, “Well there </w:t>
-      </w:r>
-      <w:proofErr w:type="spellStart"/>
-      <w:r>
-        <w:t>ain’t</w:t>
-      </w:r>
-      <w:proofErr w:type="spellEnd"/>
-      <w:r>
-        <w:t>.”</w:t>
+        <w:t>The wolf growls at Jack, ending in another big sigh and rolling her eyes. She puts her front legs out straight and puts her head down, closing her eyes. Jack stares at her for a moment before uttering, “Well there ain’t.”</w:t>
       </w:r>
     </w:p>
     <w:p>
@@ -593,12 +585,18 @@
         <w:t>, but not enough to awaken hi</w:t>
       </w:r>
       <w:r>
-        <w:t xml:space="preserve">m: </w:t>
+        <w:t>m</w:t>
+      </w:r>
+      <w:r>
+        <w:t>.</w:t>
       </w:r>
       <w:r>
         <w:t xml:space="preserve"> </w:t>
       </w:r>
       <w:r>
+        <w:t xml:space="preserve"> </w:t>
+      </w:r>
+      <w:r>
         <w:rPr>
           <w:i/>
           <w:iCs/>
@@ -671,7 +669,13 @@
         <w:t>He’s in the valley. No wonder he’s cold and stiff.</w:t>
       </w:r>
       <w:r>
-        <w:t xml:space="preserve"> He tries to move his neck, but it is pinned by something creating an ache that temporarily silences the bladder. </w:t>
+        <w:t xml:space="preserve"> He tries to move his neck, but it is pinned by something</w:t>
+      </w:r>
+      <w:r>
+        <w:t>,</w:t>
+      </w:r>
+      <w:r>
+        <w:t xml:space="preserve"> creating an ache that temporarily silences the bladder. </w:t>
       </w:r>
       <w:r>
         <w:rPr>
@@ -686,7 +690,13 @@
     </w:p>
     <w:p>
       <w:r>
-        <w:t>He rolls over to the side tugging on the hair hoping to free it enough to sit up, but it’s still got him pinned flat. He grunts and rolls completely over onto his stomach before getting gingerly up on elbows and knees</w:t>
+        <w:t>He rolls over to the side</w:t>
+      </w:r>
+      <w:r>
+        <w:t>,</w:t>
+      </w:r>
+      <w:r>
+        <w:t xml:space="preserve"> tugging on the hair hoping to free it enough to sit up, but it’s still got him pinned flat. He grunts and rolls completely over onto his stomach before getting gingerly up on elbows and knees</w:t>
       </w:r>
       <w:r>
         <w:t>,</w:t>
@@ -707,7 +717,13 @@
         <w:t>,</w:t>
       </w:r>
       <w:r>
-        <w:t xml:space="preserve"> tossing them onto the ground. He rises slowly testing his legs. They seem stable enough if not achy from age and </w:t>
+        <w:t xml:space="preserve"> tossing them onto the ground. He rises slowly</w:t>
+      </w:r>
+      <w:r>
+        <w:t>,</w:t>
+      </w:r>
+      <w:r>
+        <w:t xml:space="preserve"> testing his legs. They seem stable enough if not achy from age and </w:t>
       </w:r>
       <w:r>
         <w:t xml:space="preserve">a </w:t>
@@ -740,7 +756,13 @@
         <w:t>copse,</w:t>
       </w:r>
       <w:r>
-        <w:t xml:space="preserve"> but he had moved in a position where the outcrop was blocking his view.</w:t>
+        <w:t xml:space="preserve"> but he had moved in</w:t>
+      </w:r>
+      <w:r>
+        <w:t>to</w:t>
+      </w:r>
+      <w:r>
+        <w:t xml:space="preserve"> a position where the outcrop was blocking his view.</w:t>
       </w:r>
       <w:r>
         <w:t xml:space="preserve"> A moment of panic sets in.</w:t>
@@ -786,23 +808,7 @@
           <w:i/>
           <w:iCs/>
         </w:rPr>
-        <w:t xml:space="preserve"> had to show </w:t>
-      </w:r>
-      <w:proofErr w:type="gramStart"/>
-      <w:r>
-        <w:rPr>
-          <w:i/>
-          <w:iCs/>
-        </w:rPr>
-        <w:t>up</w:t>
-      </w:r>
-      <w:proofErr w:type="gramEnd"/>
-      <w:r>
-        <w:rPr>
-          <w:i/>
-          <w:iCs/>
-        </w:rPr>
-        <w:t xml:space="preserve"> and </w:t>
+        <w:t xml:space="preserve"> had to show up and </w:t>
       </w:r>
       <w:r>
         <w:rPr>
@@ -855,15 +861,7 @@
         <w:t>Aeyren hears the commotion from CT and flies to land on her shoulder, bobbing his head in agreement. Then two wolves flank CT. The look between CT and Aeyren and where Jack is still standing with his head bowed.</w:t>
       </w:r>
       <w:r>
-        <w:t xml:space="preserve"> They nudge CT and Aeyren back to the edge of the </w:t>
-      </w:r>
-      <w:proofErr w:type="spellStart"/>
-      <w:r>
-        <w:t>copse</w:t>
-      </w:r>
-      <w:proofErr w:type="spellEnd"/>
-      <w:r>
-        <w:t>. They turn to Jack and stand beside him, looking up and leaning against him to let him know he’s not at fault. He gently caresses a head in each hand. “Thank you, Mama. Thank you, Gran-ma-ma. But I’m afraid I did make a mess of things.”</w:t>
+        <w:t xml:space="preserve"> They nudge CT and Aeyren back to the edge of the copse. They turn to Jack and stand beside him, looking up and leaning against him to let him know he’s not at fault. He gently caresses a head in each hand. “Thank you, Mama. Thank you, Gran-ma-ma. But I’m afraid I did make a mess of things.”</w:t>
       </w:r>
     </w:p>
     <w:p>
@@ -881,7 +879,13 @@
         <w:t xml:space="preserve"> He turns, returning to the campfire and the wolves follow him. He throws some more wood on the fire and grabs the old coffee percolator from where Lea had left it drying yesterday, amazed it still functions. He goes to the lake and fills</w:t>
       </w:r>
       <w:r>
-        <w:t xml:space="preserve"> it with water before returning to the saddle bags digging around for coffee. The wolf growls at him again. He looks at her, and in rebellion declares, “I’ve got to have caffeine to figure all of this shit out and I will replace it. So</w:t>
+        <w:t xml:space="preserve"> it with water before returning to the saddle bags</w:t>
+      </w:r>
+      <w:r>
+        <w:t>,</w:t>
+      </w:r>
+      <w:r>
+        <w:t xml:space="preserve"> digging around for coffee. The wolf growls at him again. He looks at her, and in rebellion declares, “I’ve got to have caffeine to figure all of this shit out and I will replace it. So</w:t>
       </w:r>
       <w:r>
         <w:t>…</w:t>
@@ -904,7 +908,13 @@
     </w:p>
     <w:p>
       <w:r>
-        <w:t>She huffs and returns to copse, laying down next to Lea. He digs through the saddle bag finally finding the bag of coffee and disappointed there is just barely enough for one more pot. He looks up at the other wolf and grumbles</w:t>
+        <w:t>She huffs and returns to copse, laying down next to Lea. He digs through the saddle bag</w:t>
+      </w:r>
+      <w:r>
+        <w:t>,</w:t>
+      </w:r>
+      <w:r>
+        <w:t xml:space="preserve"> finally finding the bag of coffee and disappointed there is just barely enough for one more pot. He looks up at the other wolf and grumbles</w:t>
       </w:r>
       <w:r>
         <w:t>,</w:t>
@@ -1074,28 +1084,12 @@
         <w:t xml:space="preserve">Davey </w:t>
       </w:r>
       <w:r>
-        <w:t xml:space="preserve">appears at his elbow, yawning and stretching. “Ya know, you </w:t>
-      </w:r>
-      <w:proofErr w:type="spellStart"/>
-      <w:r>
-        <w:t>coulda</w:t>
-      </w:r>
-      <w:proofErr w:type="spellEnd"/>
-      <w:r>
-        <w:t xml:space="preserve"> at least refilled the coffee pot after you got the last cup.”</w:t>
-      </w:r>
-    </w:p>
-    <w:p>
-      <w:r>
-        <w:t xml:space="preserve">Frank looks over at his friend. “And you </w:t>
-      </w:r>
-      <w:proofErr w:type="spellStart"/>
-      <w:r>
-        <w:t>coulda</w:t>
-      </w:r>
-      <w:proofErr w:type="spellEnd"/>
-      <w:r>
-        <w:t xml:space="preserve"> brushed your hair before coming downstairs.”</w:t>
+        <w:t>appears at his elbow, yawning and stretching. “Ya know, you coulda at least refilled the coffee pot after you got the last cup.”</w:t>
+      </w:r>
+    </w:p>
+    <w:p>
+      <w:r>
+        <w:t>Frank looks over at his friend. “And you coulda brushed your hair before coming downstairs.”</w:t>
       </w:r>
     </w:p>
     <w:p>
@@ -1136,7 +1130,10 @@
         <w:t>t</w:t>
       </w:r>
       <w:r>
-        <w:t xml:space="preserve"> case scenarios in his head as he steps off the porch to meet Jack across the yard. He tries to play it cool. “Hey man. Sorry ‘bout that. Thought maybe Kaya was going after a bear or something. Didn’t expect to see you this morning.”</w:t>
+        <w:t>-</w:t>
+      </w:r>
+      <w:r>
+        <w:t>case scenarios in his head as he steps off the porch to meet Jack across the yard. He tries to play it cool. “Hey man. Sorry ‘bout that. Thought maybe Kaya was going after a bear or something. Didn’t expect to see you this morning.”</w:t>
       </w:r>
     </w:p>
     <w:p>
@@ -1151,24 +1148,11 @@
       <w:r>
         <w:t xml:space="preserve">She’s not okay, but she is alive. </w:t>
       </w:r>
-      <w:proofErr w:type="gramStart"/>
-      <w:r>
-        <w:t>So</w:t>
-      </w:r>
-      <w:proofErr w:type="gramEnd"/>
-      <w:r>
-        <w:t xml:space="preserve"> take a breath for a minute and calm down. Is there somewhere we can talk uninterrupted? Oh, and I found your bridge. It’s wedged </w:t>
-      </w:r>
-      <w:r>
-        <w:t xml:space="preserve">in the big bend of the river close to the valley. I can help lead you to it, if you </w:t>
-      </w:r>
-      <w:proofErr w:type="spellStart"/>
-      <w:r>
-        <w:t>wanna</w:t>
-      </w:r>
-      <w:proofErr w:type="spellEnd"/>
-      <w:r>
-        <w:t xml:space="preserve"> fetch it later.</w:t>
+      <w:r>
+        <w:t xml:space="preserve">So take a breath for a minute and calm down. Is there somewhere we can talk uninterrupted? Oh, and I found your bridge. It’s wedged </w:t>
+      </w:r>
+      <w:r>
+        <w:t>in the big bend of the river close to the valley. I can help lead you to it, if you wanna fetch it later.</w:t>
       </w:r>
       <w:r>
         <w:t>”</w:t>
@@ -1201,15 +1185,7 @@
     </w:p>
     <w:p>
       <w:r>
-        <w:t xml:space="preserve">Lynn studies her husband for a minute, but finds nothing wrong other than his quietness this morning. She leans down kissing his cheek. “Okay, but we are about to head into town to do some grocery </w:t>
-      </w:r>
-      <w:proofErr w:type="gramStart"/>
-      <w:r>
-        <w:t>shopping</w:t>
-      </w:r>
-      <w:proofErr w:type="gramEnd"/>
-      <w:r>
-        <w:t xml:space="preserve"> and I guess we’ll take the kids with us now. Try not to get stuck or stranded.”</w:t>
+        <w:t>Lynn studies her husband for a minute, but finds nothing wrong other than his quietness this morning. She leans down kissing his cheek. “Okay, but we are about to head into town to do some grocery shopping and I guess we’ll take the kids with us now. Try not to get stuck or stranded.”</w:t>
       </w:r>
     </w:p>
     <w:p>
@@ -1297,15 +1273,7 @@
         <w:t xml:space="preserve"> it used to be part of the reservation, but was turned to forest land when they decreased the size of the rez. It’s been passed down mother to daughter for generations</w:t>
       </w:r>
       <w:r>
-        <w:t xml:space="preserve">. The conditions of the sale </w:t>
-      </w:r>
-      <w:proofErr w:type="gramStart"/>
-      <w:r>
-        <w:t>were</w:t>
-      </w:r>
-      <w:proofErr w:type="gramEnd"/>
-      <w:r>
-        <w:t xml:space="preserve"> the family maintained all the logging, mineral, oil and water rights to the land and thus controlled its use. </w:t>
+        <w:t xml:space="preserve">. The conditions of the sale were the family maintained all the logging, mineral, oil and water rights to the land and thus controlled its use. </w:t>
       </w:r>
     </w:p>
     <w:p>
@@ -1325,15 +1293,7 @@
         <w:t>s</w:t>
       </w:r>
       <w:r>
-        <w:t xml:space="preserve"> of my head to drought and then wildfire. The bottom had fallen out of the beef </w:t>
-      </w:r>
-      <w:proofErr w:type="gramStart"/>
-      <w:r>
-        <w:t>market</w:t>
-      </w:r>
-      <w:proofErr w:type="gramEnd"/>
-      <w:r>
-        <w:t xml:space="preserve"> and I was hard pressed to keep the lands we had. Some local yahoo who was part owner in the logging company got into politics and convinced BLM to force the sale of the land with the logging rights. </w:t>
+        <w:t xml:space="preserve"> of my head to drought and then wildfire. The bottom had fallen out of the beef market and I was hard pressed to keep the lands we had. Some local yahoo who was part owner in the logging company got into politics and convinced BLM to force the sale of the land with the logging rights. </w:t>
       </w:r>
       <w:r>
         <w:t>They trumped up some bilge about her behind on property taxes or some such. Her then</w:t>
@@ -1356,15 +1316,7 @@
         <w:t>Davey causes both of them to jump as he says, “</w:t>
       </w:r>
       <w:r>
-        <w:t xml:space="preserve">Lucky for the both of you Kevin knows his shit. Now if we can just teach Aaron. You two behemoths </w:t>
-      </w:r>
-      <w:proofErr w:type="spellStart"/>
-      <w:r>
-        <w:t>wanna</w:t>
-      </w:r>
-      <w:proofErr w:type="spellEnd"/>
-      <w:r>
-        <w:t xml:space="preserve"> move before I drop the coffee pot?”</w:t>
+        <w:t>Lucky for the both of you Kevin knows his shit. Now if we can just teach Aaron. You two behemoths wanna move before I drop the coffee pot?”</w:t>
       </w:r>
     </w:p>
     <w:p>
@@ -1421,15 +1373,7 @@
         <w:t>Frank being frank, oh the irony.</w:t>
       </w:r>
       <w:r>
-        <w:t xml:space="preserve"> He has to tread carefully here and is not sure how much to reveal. “Yes. It probably does. This is Lea’s forte for explaining and she’s not available to do that. So, I can only confirm </w:t>
-      </w:r>
-      <w:proofErr w:type="gramStart"/>
-      <w:r>
-        <w:t>it</w:t>
-      </w:r>
-      <w:proofErr w:type="gramEnd"/>
-      <w:r>
-        <w:t xml:space="preserve"> but I cannot explain the mechanics of it other than you, Frank, have bonded and you, Davey, are bonding to her.”</w:t>
+        <w:t xml:space="preserve"> He has to tread carefully here and is not sure how much to reveal. “Yes. It probably does. This is Lea’s forte for explaining and she’s not available to do that. So, I can only confirm it but I cannot explain the mechanics of it other than you, Frank, have bonded and you, Davey, are bonding to her.”</w:t>
       </w:r>
     </w:p>
     <w:p>
@@ -1594,15 +1538,7 @@
         <w:t xml:space="preserve"> last night. </w:t>
       </w:r>
       <w:r>
-        <w:t>It just seemed, I dunno, Snow White-</w:t>
-      </w:r>
-      <w:proofErr w:type="spellStart"/>
-      <w:r>
-        <w:t>ish</w:t>
-      </w:r>
-      <w:proofErr w:type="spellEnd"/>
-      <w:r>
-        <w:t xml:space="preserve">. </w:t>
+        <w:t xml:space="preserve">It just seemed, I dunno, Snow White-ish. </w:t>
       </w:r>
       <w:r>
         <w:t>That was part of the conversation she had with us while you were in the kitchen. She also talked about her family and that she lost her son and a brother</w:t>
@@ -1665,23 +1601,7 @@
         <w:t>s</w:t>
       </w:r>
       <w:r>
-        <w:t>. “</w:t>
-      </w:r>
-      <w:proofErr w:type="gramStart"/>
-      <w:r>
-        <w:t>Again</w:t>
-      </w:r>
-      <w:proofErr w:type="gramEnd"/>
-      <w:r>
-        <w:t xml:space="preserve"> with an empty coffee pot. Where is the </w:t>
-      </w:r>
-      <w:proofErr w:type="spellStart"/>
-      <w:r>
-        <w:t>friggin</w:t>
-      </w:r>
-      <w:proofErr w:type="spellEnd"/>
-      <w:r>
-        <w:t>’ coffee?”</w:t>
+        <w:t>. “Again with an empty coffee pot. Where is the friggin’ coffee?”</w:t>
       </w:r>
     </w:p>
     <w:p>
@@ -1747,13 +1667,8 @@
         <w:t xml:space="preserve">it </w:t>
       </w:r>
       <w:r>
-        <w:t xml:space="preserve">back in his pocket as he leans back again in his chair. “To my </w:t>
-      </w:r>
-      <w:proofErr w:type="spellStart"/>
-      <w:r>
-        <w:t>thinkin</w:t>
-      </w:r>
-      <w:proofErr w:type="spellEnd"/>
+        <w:t>back in his pocket as he leans back again in his chair. “To my thinkin</w:t>
+      </w:r>
       <w:r>
         <w:t>’</w:t>
       </w:r>
@@ -1763,23 +1678,7 @@
     </w:p>
     <w:p>
       <w:r>
-        <w:t>Frank’s eyes widen. “</w:t>
-      </w:r>
-      <w:proofErr w:type="spellStart"/>
-      <w:r>
-        <w:t>Dayum</w:t>
-      </w:r>
-      <w:proofErr w:type="spellEnd"/>
-      <w:r>
-        <w:t xml:space="preserve">. I </w:t>
-      </w:r>
-      <w:proofErr w:type="spellStart"/>
-      <w:r>
-        <w:t>shoulda</w:t>
-      </w:r>
-      <w:proofErr w:type="spellEnd"/>
-      <w:r>
-        <w:t xml:space="preserve"> been part of that class. Never</w:t>
+        <w:t>Frank’s eyes widen. “Dayum. I shoulda been part of that class. Never</w:t>
       </w:r>
       <w:r>
         <w:t xml:space="preserve"> </w:t>
@@ -1790,7 +1689,13 @@
     </w:p>
     <w:p>
       <w:r>
-        <w:t xml:space="preserve">Jack laces his fingers and places them behind his head, leaning back further and looking at the ceiling. “No, not really. The aftermath didn’t help her in that department. Clay and Grant tag-teamed her making it worse. They accused her of being distracted, but the skid marks in the mud proved she wasn’t. Even the investigators with the insurance company and police department said if it had not been so slick, she would have stopped in plenty of time. </w:t>
+        <w:t>Jack laces his fingers and places them behind his head, leaning back further and looking at the ceiling. “No, not really. The aftermath didn’t help her in that department. Clay and Grant tag-teamed her</w:t>
+      </w:r>
+      <w:r>
+        <w:t>,</w:t>
+      </w:r>
+      <w:r>
+        <w:t xml:space="preserve"> making it worse. They accused her of being distracted, but the skid marks in the mud proved she wasn’t. Even the investigators with the insurance company and police department said if it had not been so slick, she would have stopped in plenty of time. </w:t>
       </w:r>
     </w:p>
     <w:p>
@@ -1809,39 +1714,15 @@
     </w:p>
     <w:p>
       <w:r>
-        <w:t xml:space="preserve">Davey shrugs. “I’m sorry. </w:t>
-      </w:r>
-      <w:proofErr w:type="gramStart"/>
-      <w:r>
-        <w:t>No</w:t>
-      </w:r>
-      <w:proofErr w:type="gramEnd"/>
-      <w:r>
-        <w:t xml:space="preserve"> I’m not sorry</w:t>
-      </w:r>
-      <w:r>
-        <w:t xml:space="preserve">. But Clay and Grant sound like real pricks. So, that </w:t>
-      </w:r>
-      <w:proofErr w:type="spellStart"/>
-      <w:r>
-        <w:t>shoulda</w:t>
-      </w:r>
-      <w:proofErr w:type="spellEnd"/>
-      <w:r>
-        <w:t xml:space="preserve"> convinced her she wasn’t at fault for River and Krystal’s death. But what about Kaleb? Was she blamed for that too?”</w:t>
-      </w:r>
-    </w:p>
-    <w:p>
-      <w:r>
-        <w:t xml:space="preserve">Jack leans forward with the front feet of the chair making a thud. “In spades. They sued Ram and the makers of the switch, but lost that one because she </w:t>
-      </w:r>
-      <w:proofErr w:type="spellStart"/>
-      <w:r>
-        <w:t>coulda</w:t>
-      </w:r>
-      <w:proofErr w:type="spellEnd"/>
-      <w:r>
-        <w:t xml:space="preserve"> manually turned off the airbag</w:t>
+        <w:t>Davey shrugs. “I’m sorry. No I’m not sorry</w:t>
+      </w:r>
+      <w:r>
+        <w:t>. But Clay and Grant sound like real pricks. So, that shoulda convinced her she wasn’t at fault for River and Krystal’s death. But what about Kaleb? Was she blamed for that too?”</w:t>
+      </w:r>
+    </w:p>
+    <w:p>
+      <w:r>
+        <w:t>Jack leans forward with the front feet of the chair making a thud. “In spades. They sued Ram and the makers of the switch, but lost that one because she coulda manually turned off the airbag</w:t>
       </w:r>
       <w:r>
         <w:t>, but didn’t</w:t>
@@ -1868,15 +1749,7 @@
         <w:t>n</w:t>
       </w:r>
       <w:r>
-        <w:t xml:space="preserve"> Clay really let her have it by blaming her for her heathen beliefs and so-called gifts and a fat lot of good they did, because she </w:t>
-      </w:r>
-      <w:proofErr w:type="spellStart"/>
-      <w:r>
-        <w:t>coulda</w:t>
-      </w:r>
-      <w:proofErr w:type="spellEnd"/>
-      <w:r>
-        <w:t xml:space="preserve"> used them to prevent it. Blamed her for being obsessed with her potions instead of watching the road.”</w:t>
+        <w:t xml:space="preserve"> Clay really let her have it by blaming her for her heathen beliefs and so-called gifts and a fat lot of good they did, because she coulda used them to prevent it. Blamed her for being obsessed with her potions instead of watching the road.”</w:t>
       </w:r>
     </w:p>
     <w:p>
@@ -1903,21 +1776,8 @@
     </w:p>
     <w:p>
       <w:r>
-        <w:t xml:space="preserve">Jack chuckles. “Sorry. So, part of the reason for them </w:t>
-      </w:r>
-      <w:proofErr w:type="spellStart"/>
-      <w:r>
-        <w:t>goin</w:t>
-      </w:r>
-      <w:proofErr w:type="spellEnd"/>
-      <w:r>
-        <w:t xml:space="preserve">’ out that night was to celebrate </w:t>
-      </w:r>
-      <w:proofErr w:type="spellStart"/>
-      <w:r>
-        <w:t>finishin</w:t>
-      </w:r>
-      <w:proofErr w:type="spellEnd"/>
+        <w:t>Jack chuckles. “Sorry. So, part of the reason for them goin’ out that night was to celebrate finishin</w:t>
+      </w:r>
       <w:r>
         <w:t>’</w:t>
       </w:r>
@@ -1944,15 +1804,7 @@
     </w:p>
     <w:p>
       <w:r>
-        <w:t xml:space="preserve">Jack sadly shakes his head no. “That was just the start to how she wound up seeking sanctuary, I guess you would call it, in the Valley. There were a lot of </w:t>
-      </w:r>
-      <w:proofErr w:type="gramStart"/>
-      <w:r>
-        <w:t>pressures</w:t>
-      </w:r>
-      <w:proofErr w:type="gramEnd"/>
-      <w:r>
-        <w:t xml:space="preserve"> and she succumbed to bullying </w:t>
+        <w:t xml:space="preserve">Jack sadly shakes his head no. “That was just the start to how she wound up seeking sanctuary, I guess you would call it, in the Valley. There were a lot of pressures and she succumbed to bullying </w:t>
       </w:r>
       <w:r>
         <w:t>and a lot of self-doubt inflicted on her. The only support she had was Mama, because I was too busy dealing with my own shit, that when Mama passed</w:t>
@@ -1961,15 +1813,7 @@
         <w:t>,</w:t>
       </w:r>
       <w:r>
-        <w:t xml:space="preserve"> she really didn’t have anyone left. Her husband betrayed her in a brutal </w:t>
-      </w:r>
-      <w:proofErr w:type="gramStart"/>
-      <w:r>
-        <w:t>way</w:t>
-      </w:r>
-      <w:proofErr w:type="gramEnd"/>
-      <w:r>
-        <w:t xml:space="preserve"> and her daughter was off living her own life.  Her friends had moved away and well, she finally withdrew to the Valley. Most of us didn’t realize she wasn’t quietly humming around in the background anymore until… that’s more than you need to know, but to answer your question she retreated to the Valley at the beginning of the year and to my knowledge, you, Davey, and his brothers are the first to have contact with her outside of the family. She said it to me right before… ‘too much, too soon.’”</w:t>
+        <w:t xml:space="preserve"> she really didn’t have anyone left. Her husband betrayed her in a brutal way and her daughter was off living her own life.  Her friends had moved away and well, she finally withdrew to the Valley. Most of us didn’t realize she wasn’t quietly humming around in the background anymore until… that’s more than you need to know, but to answer your question she retreated to the Valley at the beginning of the year and to my knowledge, you, Davey, and his brothers are the first to have contact with her outside of the family. She said it to me right before… ‘too much, too soon.’”</w:t>
       </w:r>
     </w:p>
     <w:p>
@@ -2069,20 +1913,18 @@
     </w:p>
     <w:p>
       <w:r>
-        <w:t xml:space="preserve">Frank shoots Davey an appalled look. “Really runt? You were the one going on and on about potions, how she was with the kids, yada </w:t>
-      </w:r>
-      <w:proofErr w:type="spellStart"/>
-      <w:r>
-        <w:t>yada</w:t>
-      </w:r>
-      <w:proofErr w:type="spellEnd"/>
-      <w:r>
-        <w:t>. Don’t play innocent here. So, could we just go and talk to her?”</w:t>
-      </w:r>
-    </w:p>
-    <w:p>
-      <w:r>
-        <w:t xml:space="preserve">Jack laughs as Davey slumps in his chair letting his body show his guilt at Frank’s calling out. “Are you sure you two aren’t blood brothers? If it were that easy we’d be talking to her now instead of conspiring around an old seventies table with plastic coated chairs. I can’t get to her. Remember when I said the guardians are watching her? I meant it. CT the bear. Aeyren the hawk. Mama and Gran-ma-ma the wolves and now Kaya the painted dog. </w:t>
+        <w:t>Frank shoots Davey an appalled look. “Really runt? You were the one going on and on about potions, how she was with the kids, yada yada. Don’t play innocent here. So, could we just go and talk to her?”</w:t>
+      </w:r>
+    </w:p>
+    <w:p>
+      <w:r>
+        <w:t>Jack laughs as Davey slumps in his chair</w:t>
+      </w:r>
+      <w:r>
+        <w:t>,</w:t>
+      </w:r>
+      <w:r>
+        <w:t xml:space="preserve"> letting his body show his guilt at Frank’s calling out. “Are you sure you two aren’t blood brothers? If it were that easy we’d be talking to her now instead of conspiring around an old seventies table with plastic coated chairs. I can’t get to her. Remember when I said the guardians are watching her? I meant it. CT the bear. Aeyren the hawk. Mama and Gran-ma-ma the wolves and now Kaya the painted dog. </w:t>
       </w:r>
       <w:r>
         <w:t>CT and Aeyren blame me and now Kaya will too. Nope. We have to figure out a way to do that from afar. The only way I know of is through a dream weaver. A person that can enter another’s dream and shape it into the truth the person dreaming needs to hear.”</w:t>
@@ -2139,15 +1981,7 @@
         <w:t xml:space="preserve">a </w:t>
       </w:r>
       <w:r>
-        <w:t xml:space="preserve">book on it. We don’t need no </w:t>
-      </w:r>
-      <w:proofErr w:type="spellStart"/>
-      <w:r>
-        <w:t>stinkin</w:t>
-      </w:r>
-      <w:proofErr w:type="spellEnd"/>
-      <w:r>
-        <w:t>’ shaman. We got the family library. You two fancy a trip to Lea’s estate?”</w:t>
+        <w:t>book on it. We don’t need no stinkin’ shaman. We got the family library. You two fancy a trip to Lea’s estate?”</w:t>
       </w:r>
     </w:p>
     <w:p>
@@ -2166,30 +2000,17 @@
     </w:p>
     <w:p>
       <w:r>
-        <w:t xml:space="preserve">Jack chuckles, “Estate. Let me guess, she said house or cabin? Let’s just say our mother’s stepfather was a very wealthy British ex-pat. Also, we need a flatbed </w:t>
-      </w:r>
-      <w:proofErr w:type="gramStart"/>
-      <w:r>
-        <w:t>truck</w:t>
-      </w:r>
-      <w:proofErr w:type="gramEnd"/>
-      <w:r>
-        <w:t xml:space="preserve"> and we can kill two birds with one stone, so to speak.”</w:t>
+        <w:t>Jack chuckles, “Estate. Let me guess, she said house or cabin? Let’s just say our mother’s stepfather was a very wealthy British ex-pat. Also, we need a flatbed truck and we can kill two birds with one stone, so to speak.”</w:t>
       </w:r>
     </w:p>
     <w:p>
       <w:r>
         <w:lastRenderedPageBreak/>
-        <w:t xml:space="preserve">Frank looks at Davey who nods. “I don’t have a flatbed. Why do we need one? And I don’t see a problem going to Lea’s if she doesn’t have a problem with us going there with her not there. ‘Two birds with one stone?’ </w:t>
-      </w:r>
-      <w:proofErr w:type="spellStart"/>
-      <w:r>
-        <w:t>I’d</w:t>
+        <w:t>Frank looks at Davey who nods. “I don’t have a flatbed. Why do we need one? And I don’t see a problem going to Lea’s if she doesn’t have a problem with us going there with her not there. ‘Two birds with one stone?’ I’d</w:t>
       </w:r>
       <w:r>
         <w:t>’ve</w:t>
       </w:r>
-      <w:proofErr w:type="spellEnd"/>
       <w:r>
         <w:t xml:space="preserve"> thought that was a phrase you would avoid.”</w:t>
       </w:r>
@@ -2217,23 +2038,7 @@
         <w:t xml:space="preserve">so we can fetch your bridge, but we can use the one from the estate. </w:t>
       </w:r>
       <w:r>
-        <w:t xml:space="preserve">This might take a couple of days, because we also have to find the book, read it and then figure out how to apply it. Can you be gone a couple of days? And as for Lea having a problem with it, yea she probably will, but it’s for her own good, so she’ll forgive y’all. Me on the other hand… I feel another attempted </w:t>
-      </w:r>
-      <w:proofErr w:type="spellStart"/>
-      <w:r>
-        <w:t>drownin</w:t>
-      </w:r>
-      <w:proofErr w:type="spellEnd"/>
-      <w:r>
-        <w:t xml:space="preserve">’ </w:t>
-      </w:r>
-      <w:proofErr w:type="spellStart"/>
-      <w:r>
-        <w:t>comin</w:t>
-      </w:r>
-      <w:proofErr w:type="spellEnd"/>
-      <w:r>
-        <w:t>’ on.”</w:t>
+        <w:t>This might take a couple of days, because we also have to find the book, read it and then figure out how to apply it. Can you be gone a couple of days? And as for Lea having a problem with it, yea she probably will, but it’s for her own good, so she’ll forgive y’all. Me on the other hand… I feel another attempted drownin’ comin’ on.”</w:t>
       </w:r>
     </w:p>
     <w:p>
@@ -2249,65 +2054,34 @@
         <w:t>Your brothers</w:t>
       </w:r>
       <w:r>
-        <w:t xml:space="preserve"> are </w:t>
-      </w:r>
-      <w:proofErr w:type="spellStart"/>
-      <w:r>
-        <w:t>suppose</w:t>
+        <w:t xml:space="preserve"> are suppose</w:t>
       </w:r>
       <w:r>
         <w:t>ta</w:t>
       </w:r>
-      <w:proofErr w:type="spellEnd"/>
       <w:r>
         <w:t xml:space="preserve"> be here </w:t>
       </w:r>
       <w:r>
-        <w:t xml:space="preserve">in the </w:t>
-      </w:r>
-      <w:proofErr w:type="spellStart"/>
-      <w:r>
-        <w:t>mornin</w:t>
-      </w:r>
-      <w:proofErr w:type="spellEnd"/>
-      <w:r>
-        <w:t>’</w:t>
-      </w:r>
-      <w:r>
-        <w:t xml:space="preserve">, remember? We are </w:t>
-      </w:r>
-      <w:proofErr w:type="spellStart"/>
-      <w:r>
-        <w:t>supposet</w:t>
+        <w:t>in the mornin’</w:t>
+      </w:r>
+      <w:r>
+        <w:t>, remember? We are supposet</w:t>
       </w:r>
       <w:r>
         <w:t>a</w:t>
       </w:r>
-      <w:proofErr w:type="spellEnd"/>
       <w:r>
         <w:t xml:space="preserve"> be </w:t>
       </w:r>
-      <w:proofErr w:type="spellStart"/>
-      <w:r>
-        <w:t>gettin</w:t>
-      </w:r>
-      <w:proofErr w:type="spellEnd"/>
-      <w:r>
-        <w:t>’</w:t>
+      <w:r>
+        <w:t>gettin’</w:t>
       </w:r>
       <w:r>
         <w:t xml:space="preserve"> this project ready for presentation to the tourism board in two weeks.</w:t>
       </w:r>
       <w:r>
-        <w:t xml:space="preserve"> I want to help. I have to help, but…I’m torn, </w:t>
-      </w:r>
-      <w:proofErr w:type="spellStart"/>
-      <w:r>
-        <w:t>ya</w:t>
-      </w:r>
-      <w:proofErr w:type="spellEnd"/>
-      <w:r>
-        <w:t xml:space="preserve"> know?</w:t>
+        <w:t xml:space="preserve"> I want to help. I have to help, but…I’m torn, ya know?</w:t>
       </w:r>
       <w:r>
         <w:t>”</w:t>
@@ -2346,7 +2120,6 @@
       <w:r>
         <w:t>Davey rubs his hands together, vibrating with excitement. “</w:t>
       </w:r>
-      <w:proofErr w:type="spellStart"/>
       <w:r>
         <w:t>O</w:t>
       </w:r>
@@ -2354,11 +2127,7 @@
         <w:t>ooo</w:t>
       </w:r>
       <w:r>
-        <w:t>h</w:t>
-      </w:r>
-      <w:proofErr w:type="spellEnd"/>
-      <w:r>
-        <w:t xml:space="preserve"> this will be a</w:t>
+        <w:t>h this will be a</w:t>
       </w:r>
       <w:r>
         <w:t>n awesome</w:t>
@@ -2396,19 +2165,7 @@
         <w:t>,</w:t>
       </w:r>
       <w:r>
-        <w:t xml:space="preserve"> waiting anxiously for an answer, but </w:t>
-      </w:r>
-      <w:r>
-        <w:t xml:space="preserve">Frank and Jack </w:t>
-      </w:r>
-      <w:r>
-        <w:t>are just staring at him in</w:t>
-      </w:r>
-      <w:r>
-        <w:t xml:space="preserve"> stunned silence.</w:t>
-      </w:r>
-      <w:r>
-        <w:t xml:space="preserve"> They finally look at each other before deep belly laughs fill the studio. Jack replies first. “We meet at the estate. I have to get my things and Corvin and I’ll meet you at the gate.</w:t>
+        <w:t xml:space="preserve"> waiting anxiously for an answer, but Frank and Jack are just staring at him in stunned silence. They finally look at each other before deep belly laughs fill the studio. Jack replies first. “We meet at the estate. I have to get my things and Corvin and I’ll meet you at the gate.</w:t>
       </w:r>
       <w:r>
         <w:t xml:space="preserve"> It’s easy to find. Go through town and take the left fork like you are going to the rez. Just before you see the sign saying you are entering tribal lands, there is a sign that says watch tower to the right. Take it and you will come up to two gates. The one to the watch tower should be open, but the other </w:t>

</xml_diff>